<commit_message>
docs: actualizar manual de usuario
</commit_message>
<xml_diff>
--- a/src/assets/docs/Manual_Usuario_SistemaQA.docx
+++ b/src/assets/docs/Manual_Usuario_SistemaQA.docx
@@ -44,6 +44,7 @@
     </w:p>
     <w:p>
       <w:pPr>
+        <w:pStyle w:val="Title"/>
         <w:spacing w:after="200"/>
         <w:jc w:val="center"/>
       </w:pPr>
@@ -52,8 +53,7 @@
           <w:rFonts w:ascii="Calibri" w:cs="Calibri" w:eastAsia="Calibri" w:hAnsi="Calibri"/>
           <w:b/>
           <w:bCs/>
-          <w:color w:val="1F3864"/>
-          <w:sz w:val="72"/>
+          <w:sz w:val="48"/>
           <w:szCs w:val="72"/>
         </w:rPr>
         <w:t xml:space="preserve">SISTEMA QA TOTAL</w:t>
@@ -119,7 +119,7 @@
           <w:sz w:val="22"/>
           <w:szCs w:val="22"/>
         </w:rPr>
-        <w:t xml:space="preserve">Versión 1.0  ·  23 de junio de 2026</w:t>
+        <w:t>Versión 1.1  ·  4 de septiembre de 2026</w:t>
       </w:r>
     </w:p>
     <w:p>
@@ -209,7 +209,7 @@
           <w:sz w:val="22"/>
           <w:szCs w:val="22"/>
         </w:rPr>
-        <w:t xml:space="preserve">Este manual describe todas las funcionalidades disponibles para cada perfil de usuario del sistema, incluyendo capturas de pantalla de referencia y procedimientos paso a paso para las operaciones más frecuentes.</w:t>
+        <w:t>Este manual describe las funcionalidades disponibles para cada perfil, el flujo vigente de pruebas y defectos, y los procedimientos para registrar evidencias, cerrar ciclos y consultar reportes. Las capturas son referenciales; los permisos y reglas descritos corresponden a la versión 1.1.</w:t>
       </w:r>
     </w:p>
     <w:p>
@@ -647,7 +647,7 @@
           <w:sz w:val="22"/>
           <w:szCs w:val="22"/>
         </w:rPr>
-        <w:t xml:space="preserve">7. Crear un Plan de Prueba para consolidar ciclos y obtener la trazabilidad.</w:t>
+        <w:t>7. Finalizar el Ciclo de Prueba, registrar la conclusión y generar el informe de cierre.</w:t>
       </w:r>
     </w:p>
     <w:p>
@@ -665,7 +665,7 @@
           <w:sz w:val="22"/>
           <w:szCs w:val="22"/>
         </w:rPr>
-        <w:t xml:space="preserve">8. Generar Reportes de avance y calidad.</w:t>
+        <w:t>8. Consultar Reportes por proyecto y ciclo, y descargar los documentos de evidencia o defecto.</w:t>
       </w:r>
     </w:p>
     <w:p>
@@ -874,15 +874,7 @@
           </w:tcPr>
           <w:p>
             <w:r>
-              <w:rPr>
-                <w:rFonts w:ascii="Calibri" w:cs="Calibri" w:eastAsia="Calibri" w:hAnsi="Calibri"/>
-                <w:b w:val="false"/>
-                <w:bCs w:val="false"/>
-                <w:color w:val="000000"/>
-                <w:sz w:val="20"/>
-                <w:szCs w:val="20"/>
-              </w:rPr>
-              <w:t xml:space="preserve">Acceso total al sistema. Gestiona usuarios, catálogos y todos los módulos. Puede eliminar cualquier registro.</w:t>
+              <w:t>Acceso total. Gestiona usuarios, catálogos y todos los módulos. Puede realizar operaciones administrativas excepcionales.</w:t>
             </w:r>
           </w:p>
         </w:tc>
@@ -954,15 +946,7 @@
           </w:tcPr>
           <w:p>
             <w:r>
-              <w:rPr>
-                <w:rFonts w:ascii="Calibri" w:cs="Calibri" w:eastAsia="Calibri" w:hAnsi="Calibri"/>
-                <w:b w:val="false"/>
-                <w:bCs w:val="false"/>
-                <w:color w:val="000000"/>
-                <w:sz w:val="20"/>
-                <w:szCs w:val="20"/>
-              </w:rPr>
-              <w:t xml:space="preserve">Lidera el equipo de pruebas. Crea y administra proyectos, ciclos, planes y casos de prueba.</w:t>
+              <w:t>Gobierna QA. Crea y administra proyectos, requerimientos, planes y ciclos; asigna responsables QA y gestiona catálogos.</w:t>
             </w:r>
           </w:p>
         </w:tc>
@@ -1034,15 +1018,7 @@
           </w:tcPr>
           <w:p>
             <w:r>
-              <w:rPr>
-                <w:rFonts w:ascii="Calibri" w:cs="Calibri" w:eastAsia="Calibri" w:hAnsi="Calibri"/>
-                <w:b w:val="false"/>
-                <w:bCs w:val="false"/>
-                <w:color w:val="000000"/>
-                <w:sz w:val="20"/>
-                <w:szCs w:val="20"/>
-              </w:rPr>
-              <w:t xml:space="preserve">Ejecuta casos de prueba y reporta defectos. Puede crear requerimientos y casos en sus proyectos.</w:t>
+              <w:t>Crea casos de prueba, ejecuta los casos asignados, registra evidencias y defectos, y valida las respuestas de Desarrollo.</w:t>
             </w:r>
           </w:p>
         </w:tc>
@@ -1114,15 +1090,7 @@
           </w:tcPr>
           <w:p>
             <w:r>
-              <w:rPr>
-                <w:rFonts w:ascii="Calibri" w:cs="Calibri" w:eastAsia="Calibri" w:hAnsi="Calibri"/>
-                <w:b w:val="false"/>
-                <w:bCs w:val="false"/>
-                <w:color w:val="000000"/>
-                <w:sz w:val="20"/>
-                <w:szCs w:val="20"/>
-              </w:rPr>
-              <w:t xml:space="preserve">Supervisa el avance de proyectos. Asigna defectos a desarrolladores. Recibe reporte diario por correo.</w:t>
+              <w:t>Visualiza proyectos y avance. Recibe los defectos nuevos y los asigna individualmente o en bloque a desarrolladores.</w:t>
             </w:r>
           </w:p>
         </w:tc>
@@ -1194,15 +1162,7 @@
           </w:tcPr>
           <w:p>
             <w:r>
-              <w:rPr>
-                <w:rFonts w:ascii="Calibri" w:cs="Calibri" w:eastAsia="Calibri" w:hAnsi="Calibri"/>
-                <w:b w:val="false"/>
-                <w:bCs w:val="false"/>
-                <w:color w:val="000000"/>
-                <w:sz w:val="20"/>
-                <w:szCs w:val="20"/>
-              </w:rPr>
-              <w:t xml:space="preserve">Solo accede a Defectos para revisar y responder los defectos asignados. No ve módulos de QA.</w:t>
+              <w:t>Consulta sus defectos asignados y registra la respuesta de Desarrollo como Atendido o No Aplica.</w:t>
             </w:r>
           </w:p>
         </w:tc>
@@ -1887,15 +1847,7 @@
           </w:tcPr>
           <w:p>
             <w:r>
-              <w:rPr>
-                <w:rFonts w:ascii="Calibri" w:cs="Calibri" w:eastAsia="Calibri" w:hAnsi="Calibri"/>
-                <w:b w:val="false"/>
-                <w:bCs w:val="false"/>
-                <w:color w:val="000000"/>
-                <w:sz w:val="20"/>
-                <w:szCs w:val="20"/>
-              </w:rPr>
-              <w:t xml:space="preserve">Solo Administrador</w:t>
+              <w:t>Administrador y QA Lead</w:t>
             </w:r>
           </w:p>
         </w:tc>
@@ -1904,7 +1856,7 @@
     <w:p>
       <w:pPr>
         <w:pStyle w:val="Heading1"/>
-        <w:pageBreakBefore/>
+        <w:pageBreakBefore w:val="0"/>
         <w:spacing w:after="200" w:before="200"/>
       </w:pPr>
       <w:r>
@@ -1942,7 +1894,7 @@
           <wp:inline distT="0" distB="0" distL="0" distR="0">
             <wp:extent cx="5219700" cy="3114675"/>
             <wp:effectExtent t="0" r="0" b="0" l="0"/>
-            <wp:docPr id="1" name="" descr="" title=""/>
+            <wp:docPr id="1" name="Captura 1" descr="Pantalla de inicio de sesión del Sistema QA" title="Pantalla de inicio de sesión del Sistema QA"/>
             <wp:cNvGraphicFramePr>
               <a:graphicFrameLocks xmlns:a="http://schemas.openxmlformats.org/drawingml/2006/main" noChangeAspect="1"/>
             </wp:cNvGraphicFramePr>
@@ -2164,7 +2116,7 @@
           <wp:inline distT="0" distB="0" distL="0" distR="0">
             <wp:extent cx="5219700" cy="3114675"/>
             <wp:effectExtent t="0" r="0" b="0" l="0"/>
-            <wp:docPr id="1" name="" descr="" title=""/>
+            <wp:docPr id="2" name="Captura 2" descr="Dashboard con indicadores de proyectos, casos y defectos" title="Dashboard con indicadores de proyectos, casos y defectos"/>
             <wp:cNvGraphicFramePr>
               <a:graphicFrameLocks xmlns:a="http://schemas.openxmlformats.org/drawingml/2006/main" noChangeAspect="1"/>
             </wp:cNvGraphicFramePr>
@@ -2347,7 +2299,7 @@
           <w:sz w:val="22"/>
           <w:szCs w:val="22"/>
         </w:rPr>
-        <w:t xml:space="preserve">Casos por estado: distribución de todos los casos de prueba.</w:t>
+        <w:t>Casos del ciclo por estado: distribución calculada sobre el ciclo vigente, separando ejecutados y pendientes.</w:t>
       </w:r>
     </w:p>
     <w:p>
@@ -2365,7 +2317,7 @@
           <w:sz w:val="22"/>
           <w:szCs w:val="22"/>
         </w:rPr>
-        <w:t xml:space="preserve">Defectos recientes: los 10 últimos defectos registrados.</w:t>
+        <w:t>Defectos abiertos por severidad y últimos defectos reportados, de acuerdo con los proyectos visibles para el usuario.</w:t>
       </w:r>
     </w:p>
     <w:p>
@@ -2450,7 +2402,7 @@
           <wp:inline distT="0" distB="0" distL="0" distR="0">
             <wp:extent cx="5219700" cy="3114675"/>
             <wp:effectExtent t="0" r="0" b="0" l="0"/>
-            <wp:docPr id="1" name="" descr="" title=""/>
+            <wp:docPr id="3" name="Captura 3" descr="Portafolio de proyectos accesibles al usuario" title="Portafolio de proyectos accesibles al usuario"/>
             <wp:cNvGraphicFramePr>
               <a:graphicFrameLocks xmlns:a="http://schemas.openxmlformats.org/drawingml/2006/main" noChangeAspect="1"/>
             </wp:cNvGraphicFramePr>
@@ -2513,7 +2465,7 @@
           <w:sz w:val="22"/>
           <w:szCs w:val="22"/>
         </w:rPr>
-        <w:t xml:space="preserve">La lista muestra todos los proyectos accesibles al usuario, con código, nombre, cliente, estado y barras de avance y aprobación.</w:t>
+        <w:t>La lista muestra los proyectos accesibles al usuario con código, nombre, cliente, estado y avance. QA Tester y Project Manager tienen acceso de consulta; las acciones de creación y modificación corresponden a Administrador y QA Lead.</w:t>
       </w:r>
     </w:p>
     <w:p>
@@ -2551,7 +2503,7 @@
           <wp:inline distT="0" distB="0" distL="0" distR="0">
             <wp:extent cx="5219700" cy="3114675"/>
             <wp:effectExtent t="0" r="0" b="0" l="0"/>
-            <wp:docPr id="1" name="" descr="" title=""/>
+            <wp:docPr id="4" name="Captura 4" descr="Formulario para registrar un nuevo proyecto" title="Formulario para registrar un nuevo proyecto"/>
             <wp:cNvGraphicFramePr>
               <a:graphicFrameLocks xmlns:a="http://schemas.openxmlformats.org/drawingml/2006/main" noChangeAspect="1"/>
             </wp:cNvGraphicFramePr>
@@ -2600,6 +2552,42 @@
         <w:t xml:space="preserve">Haz clic en "+ Nuevo Proyecto" para abrir el formulario:</w:t>
       </w:r>
     </w:p>
+    <w:p>
+      <w:pPr>
+        <w:pStyle w:val="ListParagraph"/>
+      </w:pPr>
+      <w:r>
+        <w:rPr>
+          <w:rFonts w:ascii="Calibri" w:hAnsi="Calibri"/>
+          <w:sz w:val="22"/>
+        </w:rPr>
+        <w:t>Antes de crear el proyecto, registra el cliente en Configuración &gt; Catálogos &gt; Clientes si todavía no existe. En el formulario del proyecto selecciona el nombre del cliente en la lista desplegable.</w:t>
+      </w:r>
+    </w:p>
+    <w:p>
+      <w:pPr>
+        <w:pStyle w:val="ListParagraph"/>
+      </w:pPr>
+      <w:r>
+        <w:rPr>
+          <w:rFonts w:ascii="Calibri" w:hAnsi="Calibri"/>
+          <w:sz w:val="22"/>
+        </w:rPr>
+        <w:t>El código interno y el orden del cliente se generan automáticamente de forma incremental; no se solicitan en el modal Nuevo Cliente.</w:t>
+      </w:r>
+    </w:p>
+    <w:p>
+      <w:pPr>
+        <w:pStyle w:val="ListParagraph"/>
+      </w:pPr>
+      <w:r>
+        <w:rPr>
+          <w:rFonts w:ascii="Calibri" w:hAnsi="Calibri"/>
+          <w:sz w:val="22"/>
+        </w:rPr>
+        <w:t>Al asignar un Responsable QA, el sistema envía una notificación institucional al tester y conserva visibles las ejecuciones y defectos anteriores del proyecto.</w:t>
+      </w:r>
+    </w:p>
     <w:tbl>
       <w:tblPr>
         <w:tblW w:type="pct" w:w="100%"/>
@@ -2822,15 +2810,7 @@
           </w:tcPr>
           <w:p>
             <w:r>
-              <w:rPr>
-                <w:rFonts w:ascii="Calibri" w:cs="Calibri" w:eastAsia="Calibri" w:hAnsi="Calibri"/>
-                <w:b w:val="false"/>
-                <w:bCs w:val="false"/>
-                <w:color w:val="000000"/>
-                <w:sz w:val="20"/>
-                <w:szCs w:val="20"/>
-              </w:rPr>
-              <w:t xml:space="preserve">Empresa o cliente asociado.</w:t>
+              <w:t>Cliente seleccionado desde el catálogo de Clientes. La lista muestra únicamente el nombre y respeta el orden configurado.</w:t>
             </w:r>
           </w:p>
         </w:tc>
@@ -3622,7 +3602,7 @@
           <wp:inline distT="0" distB="0" distL="0" distR="0">
             <wp:extent cx="5219700" cy="3114675"/>
             <wp:effectExtent t="0" r="0" b="0" l="0"/>
-            <wp:docPr id="1" name="" descr="" title=""/>
+            <wp:docPr id="5" name="Captura 5" descr="Lista de requerimientos filtrada por proyecto" title="Lista de requerimientos filtrada por proyecto"/>
             <wp:cNvGraphicFramePr>
               <a:graphicFrameLocks xmlns:a="http://schemas.openxmlformats.org/drawingml/2006/main" noChangeAspect="1"/>
             </wp:cNvGraphicFramePr>
@@ -4298,7 +4278,7 @@
           <wp:inline distT="0" distB="0" distL="0" distR="0">
             <wp:extent cx="5219700" cy="3114675"/>
             <wp:effectExtent t="0" r="0" b="0" l="0"/>
-            <wp:docPr id="1" name="" descr="" title=""/>
+            <wp:docPr id="6" name="Captura 6" descr="Lista de casos de prueba y acciones disponibles" title="Lista de casos de prueba y acciones disponibles"/>
             <wp:cNvGraphicFramePr>
               <a:graphicFrameLocks xmlns:a="http://schemas.openxmlformats.org/drawingml/2006/main" noChangeAspect="1"/>
             </wp:cNvGraphicFramePr>
@@ -4959,7 +4939,7 @@
           <w:sz w:val="22"/>
           <w:szCs w:val="22"/>
         </w:rPr>
-        <w:t xml:space="preserve">Haz clic en el ícono "play" en la fila del caso para abrir el modal de ejecución.</w:t>
+        <w:t>Abre el ciclo activo y selecciona un caso para registrar su ejecución. El detalle muestra la descripción y el resultado esperado del caso como datos no editables.</w:t>
       </w:r>
     </w:p>
     <w:p>
@@ -4974,7 +4954,7 @@
           <w:sz w:val="21"/>
           <w:szCs w:val="21"/>
         </w:rPr>
-        <w:t xml:space="preserve">💡 ⚠️  Solo se puede ejecutar si existe un Ciclo de Prueba activo. Si no hay ciclo activo, el botón aparece deshabilitado.</w:t>
+        <w:t>Solo se puede ejecutar si existe un ciclo activo y el caso no está Bloqueado. Al marcarlo Bloqueado, se deshabilitan los pasos y se registra el caso fallido y el defecto que originan el bloqueo.</w:t>
       </w:r>
     </w:p>
     <w:p>
@@ -5051,7 +5031,7 @@
           <w:sz w:val="22"/>
           <w:szCs w:val="22"/>
         </w:rPr>
-        <w:t xml:space="preserve">Pasos del caso: aparecen con botones OK / NO-OK por cada paso.</w:t>
+        <w:t>Pasos del caso: cada paso se marca OK o NO OK y puede incluir una captura. Un resultado NO OK no impide continuar con los pasos restantes; así se obtiene una evidencia completa de la ejecución.</w:t>
       </w:r>
     </w:p>
     <w:p>
@@ -5069,7 +5049,7 @@
           <w:sz w:val="22"/>
           <w:szCs w:val="22"/>
         </w:rPr>
-        <w:t xml:space="preserve">Resultado Obtenido: descripción del comportamiento observado.</w:t>
+        <w:t>Resultado Obtenido: si todos los pasos están OK, se completa con el resultado esperado; si existe un NO OK, el tester registra el comportamiento observado.</w:t>
       </w:r>
     </w:p>
     <w:p>
@@ -5105,7 +5085,7 @@
           <w:sz w:val="22"/>
           <w:szCs w:val="22"/>
         </w:rPr>
-        <w:t xml:space="preserve">Evidencia URL: enlace a capturas u otro material probatorio.</w:t>
+        <w:t>Evidencias: las capturas permanecen asociadas al paso correspondiente. En el bloque del defecto solo se consideran las capturas de pasos NO OK.</w:t>
       </w:r>
     </w:p>
     <w:p>
@@ -5128,7 +5108,43 @@
           <w:sz w:val="21"/>
           <w:szCs w:val="21"/>
         </w:rPr>
-        <w:t xml:space="preserve">💡 Si el resultado es "Fallido", se habilita el bloque de registro de defecto directamente en el modal.</w:t>
+        <w:t>Al registrar la ejecución se muestra el modal Ejecución Registrada. Si fue aprobada permite generar Evidencia Word; si fue fallida permite generar Reporte de Defecto; si fue bloqueada no muestra botones de documento.</w:t>
+      </w:r>
+    </w:p>
+    <w:p>
+      <w:pPr>
+        <w:pStyle w:val="ListParagraph"/>
+      </w:pPr>
+      <w:r>
+        <w:rPr>
+          <w:rFonts w:ascii="Calibri" w:hAnsi="Calibri"/>
+          <w:sz w:val="22"/>
+        </w:rPr>
+        <w:t>Cada nueva ejecución del mismo caso dentro del ciclo conserva una versión independiente. Las imágenes y documentos anteriores no se reemplazan.</w:t>
+      </w:r>
+    </w:p>
+    <w:p>
+      <w:pPr>
+        <w:pStyle w:val="ListParagraph"/>
+      </w:pPr>
+      <w:r>
+        <w:rPr>
+          <w:rFonts w:ascii="Calibri" w:hAnsi="Calibri"/>
+          <w:sz w:val="22"/>
+        </w:rPr>
+        <w:t>La evidencia Word incluye proyecto, requerimiento, datos del caso, pasos, acciones y capturas, pero no repite el resultado esperado por cada paso. El nombre usa el código del proyecto y del caso.</w:t>
+      </w:r>
+    </w:p>
+    <w:p>
+      <w:pPr>
+        <w:pStyle w:val="ListParagraph"/>
+      </w:pPr>
+      <w:r>
+        <w:rPr>
+          <w:rFonts w:ascii="Calibri" w:hAnsi="Calibri"/>
+          <w:sz w:val="22"/>
+        </w:rPr>
+        <w:t>El reporte de defecto incluye todos los pasos para reproducir y únicamente las capturas de los pasos NO OK.</w:t>
       </w:r>
     </w:p>
     <w:p>
@@ -5197,7 +5213,7 @@
           <w:sz w:val="22"/>
           <w:szCs w:val="22"/>
         </w:rPr>
-        <w:t xml:space="preserve">Un Ciclo de Prueba agrupa las ejecuciones de casos en un período específico. Solo puede haber un ciclo "Activo" por proyecto al mismo tiempo.</w:t>
+        <w:t>Un Ciclo de Prueba agrupa ejecuciones durante un período y asigna un Responsable QA. Solo puede existir un ciclo activo por proyecto al mismo tiempo; las fechas planificadas orientan el calendario y las fechas reales reflejan lo ejecutado.</w:t>
       </w:r>
     </w:p>
     <w:p>
@@ -5210,7 +5226,7 @@
           <wp:inline distT="0" distB="0" distL="0" distR="0">
             <wp:extent cx="5219700" cy="3114675"/>
             <wp:effectExtent t="0" r="0" b="0" l="0"/>
-            <wp:docPr id="1" name="" descr="" title=""/>
+            <wp:docPr id="7" name="Captura 7" descr="Lista de ciclos de prueba del proyecto" title="Lista de ciclos de prueba del proyecto"/>
             <wp:cNvGraphicFramePr>
               <a:graphicFrameLocks xmlns:a="http://schemas.openxmlformats.org/drawingml/2006/main" noChangeAspect="1"/>
             </wp:cNvGraphicFramePr>
@@ -5465,15 +5481,7 @@
           </w:tcPr>
           <w:p>
             <w:r>
-              <w:rPr>
-                <w:rFonts w:ascii="Calibri" w:cs="Calibri" w:eastAsia="Calibri" w:hAnsi="Calibri"/>
-                <w:b w:val="false"/>
-                <w:bCs w:val="false"/>
-                <w:color w:val="000000"/>
-                <w:sz w:val="20"/>
-                <w:szCs w:val="20"/>
-              </w:rPr>
-              <w:t xml:space="preserve">Nombre descriptivo. Ej: "Sprint 3 – Módulo Login".</w:t>
+              <w:t>Nombre descriptivo. Ejemplo: Sprint 3 - Módulo Login.</w:t>
             </w:r>
           </w:p>
         </w:tc>
@@ -5636,6 +5644,82 @@
                 <w:szCs w:val="20"/>
               </w:rPr>
               <w:t xml:space="preserve">Fecha estimada de cierre.</w:t>
+            </w:r>
+          </w:p>
+        </w:tc>
+      </w:tr>
+      <w:tr>
+        <w:tc>
+          <w:tcPr>
+            <w:tcW w:type="dxa" w:w="100"/>
+            <w:vAlign w:val="center"/>
+          </w:tcPr>
+          <w:p>
+            <w:pPr>
+              <w:spacing w:after="0" w:before="0"/>
+            </w:pPr>
+            <w:r>
+              <w:rPr>
+                <w:rFonts w:ascii="Calibri" w:hAnsi="Calibri"/>
+                <w:sz w:val="18"/>
+              </w:rPr>
+              <w:t>Responsable QA</w:t>
+            </w:r>
+          </w:p>
+        </w:tc>
+        <w:tc>
+          <w:tcPr>
+            <w:tcW w:type="dxa" w:w="100"/>
+            <w:vAlign w:val="center"/>
+          </w:tcPr>
+          <w:p>
+            <w:pPr>
+              <w:spacing w:after="0" w:before="0"/>
+            </w:pPr>
+            <w:r>
+              <w:rPr>
+                <w:rFonts w:ascii="Calibri" w:hAnsi="Calibri"/>
+                <w:sz w:val="18"/>
+              </w:rPr>
+              <w:t>Tester encargado de administrar y ejecutar el ciclo.</w:t>
+            </w:r>
+          </w:p>
+        </w:tc>
+      </w:tr>
+      <w:tr>
+        <w:tc>
+          <w:tcPr>
+            <w:tcW w:type="dxa" w:w="100"/>
+            <w:vAlign w:val="center"/>
+          </w:tcPr>
+          <w:p>
+            <w:pPr>
+              <w:spacing w:after="0" w:before="0"/>
+            </w:pPr>
+            <w:r>
+              <w:rPr>
+                <w:rFonts w:ascii="Calibri" w:hAnsi="Calibri"/>
+                <w:sz w:val="18"/>
+              </w:rPr>
+              <w:t>Conclusión</w:t>
+            </w:r>
+          </w:p>
+        </w:tc>
+        <w:tc>
+          <w:tcPr>
+            <w:tcW w:type="dxa" w:w="100"/>
+            <w:vAlign w:val="center"/>
+          </w:tcPr>
+          <w:p>
+            <w:pPr>
+              <w:spacing w:after="0" w:before="0"/>
+            </w:pPr>
+            <w:r>
+              <w:rPr>
+                <w:rFonts w:ascii="Calibri" w:hAnsi="Calibri"/>
+                <w:sz w:val="18"/>
+              </w:rPr>
+              <w:t>Resumen obligatorio al finalizar el ciclo.</w:t>
             </w:r>
           </w:p>
         </w:tc>
@@ -5661,7 +5745,7 @@
           <w:sz w:val="21"/>
           <w:szCs w:val="21"/>
         </w:rPr>
-        <w:t xml:space="preserve">💡 Al crear el ciclo queda automáticamente en estado "Activo". Los testers ya pueden ejecutar casos.</w:t>
+        <w:t>Al crear el ciclo queda listo para iniciar según sus fechas. El Responsable QA recibe los recordatorios configurados y puede ejecutar los casos cuando el ciclo está En ejecución.</w:t>
       </w:r>
     </w:p>
     <w:p>
@@ -5704,7 +5788,7 @@
           <w:sz w:val="22"/>
           <w:szCs w:val="22"/>
         </w:rPr>
-        <w:t xml:space="preserve">Activo: ciclo abierto, acepta nuevas ejecuciones.</w:t>
+        <w:t>Planificado: ciclo creado antes de su fecha real de inicio. En ejecución: acepta nuevas ejecuciones y permite gestionar sus casos.</w:t>
       </w:r>
     </w:p>
     <w:p>
@@ -5722,13 +5806,13 @@
           <w:sz w:val="22"/>
           <w:szCs w:val="22"/>
         </w:rPr>
-        <w:t xml:space="preserve">Cerrado: ciclo terminado. Se cierra con el ícono de candado. Se puede reabrir.</w:t>
+        <w:t>Finalizado: no quedan casos pendientes y el usuario selecciona Finalizar Ciclo. Debe ingresar una conclusión; el sistema genera el informe de cierre con tablas de casos y defectos y envía la notificación correspondiente.</w:t>
       </w:r>
     </w:p>
     <w:p>
       <w:pPr>
         <w:pStyle w:val="Heading1"/>
-        <w:pageBreakBefore/>
+        <w:pageBreakBefore w:val="0"/>
         <w:spacing w:after="200" w:before="200"/>
       </w:pPr>
       <w:r>
@@ -5753,7 +5837,7 @@
           <w:sz w:val="22"/>
           <w:szCs w:val="22"/>
         </w:rPr>
-        <w:t xml:space="preserve">El módulo de Ejecuciones muestra el historial completo de todas las ejecuciones con sus resultados y defectos vinculados.</w:t>
+        <w:t>El módulo de Ejecuciones muestra el historial del proyecto, incluyendo ejecuciones realizadas por testers de ciclos anteriores, con resultado, versión y defectos vinculados.</w:t>
       </w:r>
     </w:p>
     <w:p>
@@ -5766,7 +5850,7 @@
           <wp:inline distT="0" distB="0" distL="0" distR="0">
             <wp:extent cx="5219700" cy="3114675"/>
             <wp:effectExtent t="0" r="0" b="0" l="0"/>
-            <wp:docPr id="1" name="" descr="" title=""/>
+            <wp:docPr id="8" name="Captura 8" descr="Historial de ejecuciones de casos de prueba" title="Historial de ejecuciones de casos de prueba"/>
             <wp:cNvGraphicFramePr>
               <a:graphicFrameLocks xmlns:a="http://schemas.openxmlformats.org/drawingml/2006/main" noChangeAspect="1"/>
             </wp:cNvGraphicFramePr>
@@ -6324,6 +6408,82 @@
           </w:p>
         </w:tc>
       </w:tr>
+      <w:tr>
+        <w:tc>
+          <w:tcPr>
+            <w:tcW w:type="dxa" w:w="100"/>
+            <w:vAlign w:val="center"/>
+          </w:tcPr>
+          <w:p>
+            <w:pPr>
+              <w:spacing w:after="0" w:before="0"/>
+            </w:pPr>
+            <w:r>
+              <w:rPr>
+                <w:rFonts w:ascii="Calibri" w:hAnsi="Calibri"/>
+                <w:sz w:val="18"/>
+              </w:rPr>
+              <w:t>Versión de ejecución</w:t>
+            </w:r>
+          </w:p>
+        </w:tc>
+        <w:tc>
+          <w:tcPr>
+            <w:tcW w:type="dxa" w:w="100"/>
+            <w:vAlign w:val="center"/>
+          </w:tcPr>
+          <w:p>
+            <w:pPr>
+              <w:spacing w:after="0" w:before="0"/>
+            </w:pPr>
+            <w:r>
+              <w:rPr>
+                <w:rFonts w:ascii="Calibri" w:hAnsi="Calibri"/>
+                <w:sz w:val="18"/>
+              </w:rPr>
+              <w:t>Número correlativo de la ejecución del caso dentro del ciclo.</w:t>
+            </w:r>
+          </w:p>
+        </w:tc>
+      </w:tr>
+      <w:tr>
+        <w:tc>
+          <w:tcPr>
+            <w:tcW w:type="dxa" w:w="100"/>
+            <w:vAlign w:val="center"/>
+          </w:tcPr>
+          <w:p>
+            <w:pPr>
+              <w:spacing w:after="0" w:before="0"/>
+            </w:pPr>
+            <w:r>
+              <w:rPr>
+                <w:rFonts w:ascii="Calibri" w:hAnsi="Calibri"/>
+                <w:sz w:val="18"/>
+              </w:rPr>
+              <w:t>Documentos</w:t>
+            </w:r>
+          </w:p>
+        </w:tc>
+        <w:tc>
+          <w:tcPr>
+            <w:tcW w:type="dxa" w:w="100"/>
+            <w:vAlign w:val="center"/>
+          </w:tcPr>
+          <w:p>
+            <w:pPr>
+              <w:spacing w:after="0" w:before="0"/>
+            </w:pPr>
+            <w:r>
+              <w:rPr>
+                <w:rFonts w:ascii="Calibri" w:hAnsi="Calibri"/>
+                <w:sz w:val="18"/>
+              </w:rPr>
+              <w:t>Desde Visualizar se puede descargar la Evidencia Word o el Reporte de Defecto disponible.</w:t>
+            </w:r>
+          </w:p>
+        </w:tc>
+      </w:tr>
     </w:tbl>
     <w:p>
       <w:pPr>
@@ -6360,13 +6520,13 @@
           <w:sz w:val="22"/>
           <w:szCs w:val="22"/>
         </w:rPr>
-        <w:t xml:space="preserve">Haz clic en el ícono de ojo para ver el detalle completo: ambiente, resultado obtenido, observaciones y enlace al defecto asociado.</w:t>
+        <w:t>Haz clic en Visualizar para consultar la descripción del caso, ambiente, resultado obtenido, observaciones, defecto asociado y documentos generados. La descarga está disponible sin repetir la ejecución.</w:t>
       </w:r>
     </w:p>
     <w:p>
       <w:pPr>
         <w:pStyle w:val="Heading1"/>
-        <w:pageBreakBefore/>
+        <w:pageBreakBefore w:val="0"/>
         <w:spacing w:after="200" w:before="200"/>
       </w:pPr>
       <w:r>
@@ -6391,7 +6551,7 @@
           <w:sz w:val="22"/>
           <w:szCs w:val="22"/>
         </w:rPr>
-        <w:t xml:space="preserve">El módulo de Defectos permite registrar, asignar y hacer seguimiento de todos los problemas encontrados durante las pruebas.</w:t>
+        <w:t>El módulo de Defectos permite registrar, asignar y seguir los problemas encontrados. Un tester asignado a un proyecto puede consultar los defectos históricos de otros testers del mismo proyecto.</w:t>
       </w:r>
     </w:p>
     <w:p>
@@ -6404,7 +6564,7 @@
           <wp:inline distT="0" distB="0" distL="0" distR="0">
             <wp:extent cx="5219700" cy="3114675"/>
             <wp:effectExtent t="0" r="0" b="0" l="0"/>
-            <wp:docPr id="1" name="" descr="" title=""/>
+            <wp:docPr id="9" name="Captura 9" descr="Lista de defectos y estados de seguimiento" title="Lista de defectos y estados de seguimiento"/>
             <wp:cNvGraphicFramePr>
               <a:graphicFrameLocks xmlns:a="http://schemas.openxmlformats.org/drawingml/2006/main" noChangeAspect="1"/>
             </wp:cNvGraphicFramePr>
@@ -6794,15 +6954,7 @@
           </w:tcPr>
           <w:p>
             <w:r>
-              <w:rPr>
-                <w:rFonts w:ascii="Calibri" w:cs="Calibri" w:eastAsia="Calibri" w:hAnsi="Calibri"/>
-                <w:b w:val="false"/>
-                <w:bCs w:val="false"/>
-                <w:color w:val="000000"/>
-                <w:sz w:val="20"/>
-                <w:szCs w:val="20"/>
-              </w:rPr>
-              <w:t xml:space="preserve">El desarrollador marcó el defecto como atendido. Pendiente verificación.</w:t>
+              <w:t>El desarrollador respondió Atendido o No Aplica. Queda pendiente la decisión de QA.</w:t>
             </w:r>
           </w:p>
         </w:tc>
@@ -6848,15 +7000,7 @@
           </w:tcPr>
           <w:p>
             <w:r>
-              <w:rPr>
-                <w:rFonts w:ascii="Calibri" w:cs="Calibri" w:eastAsia="Calibri" w:hAnsi="Calibri"/>
-                <w:b w:val="false"/>
-                <w:bCs w:val="false"/>
-                <w:color w:val="000000"/>
-                <w:sz w:val="20"/>
-                <w:szCs w:val="20"/>
-              </w:rPr>
-              <w:t xml:space="preserve">El QA confirmó que el defecto fue corregido.</w:t>
+              <w:t>QA confirmó la corrección antes del cierre definitivo.</w:t>
             </w:r>
           </w:p>
         </w:tc>
@@ -7010,15 +7154,7 @@
           </w:tcPr>
           <w:p>
             <w:r>
-              <w:rPr>
-                <w:rFonts w:ascii="Calibri" w:cs="Calibri" w:eastAsia="Calibri" w:hAnsi="Calibri"/>
-                <w:b w:val="false"/>
-                <w:bCs w:val="false"/>
-                <w:color w:val="000000"/>
-                <w:sz w:val="20"/>
-                <w:szCs w:val="20"/>
-              </w:rPr>
-              <w:t xml:space="preserve">Revisado y confirmado que no es un error del sistema.</w:t>
+              <w:t>QA acepta la respuesta No Aplica y descarta el defecto. Si no está de acuerdo, lo reabre.</w:t>
             </w:r>
           </w:p>
         </w:tc>
@@ -7718,7 +7854,7 @@
           <w:sz w:val="22"/>
           <w:szCs w:val="22"/>
         </w:rPr>
-        <w:t xml:space="preserve">2. PM recibe correo y asigna al desarrollador (estado: Asignado).</w:t>
+        <w:t>2. PM recibe correo y asigna uno o varios defectos al desarrollador (estado: Asignado).</w:t>
       </w:r>
     </w:p>
     <w:p>
@@ -7754,7 +7890,7 @@
           <w:sz w:val="22"/>
           <w:szCs w:val="22"/>
         </w:rPr>
-        <w:t xml:space="preserve">4. Desarrollador marca como "Atendido" (estado: En Revisión).</w:t>
+        <w:t>4. Desarrollador registra Estado Desarrollo como Atendido o No Aplica y actualiza el defecto (estado QA: En Revisión).</w:t>
       </w:r>
     </w:p>
     <w:p>
@@ -7772,7 +7908,7 @@
           <w:sz w:val="22"/>
           <w:szCs w:val="22"/>
         </w:rPr>
-        <w:t xml:space="preserve">5. QA Tester verifica la corrección y cierra el defecto (estado: Cerrado).</w:t>
+        <w:t>5. Si fue Atendido, QA verifica y cierra o reabre. Si fue No Aplica, QA rechaza el defecto o reabre la observación.</w:t>
       </w:r>
     </w:p>
     <w:p>
@@ -7857,7 +7993,7 @@
           <wp:inline distT="0" distB="0" distL="0" distR="0">
             <wp:extent cx="5219700" cy="3114675"/>
             <wp:effectExtent t="0" r="0" b="0" l="0"/>
-            <wp:docPr id="1" name="" descr="" title=""/>
+            <wp:docPr id="10" name="Captura 10" descr="Lista de planes de prueba" title="Lista de planes de prueba"/>
             <wp:cNvGraphicFramePr>
               <a:graphicFrameLocks xmlns:a="http://schemas.openxmlformats.org/drawingml/2006/main" noChangeAspect="1"/>
             </wp:cNvGraphicFramePr>
@@ -9040,7 +9176,7 @@
           <w:sz w:val="22"/>
           <w:szCs w:val="22"/>
         </w:rPr>
-        <w:t xml:space="preserve">El módulo de Reportes genera un informe visual por proyecto con indicadores clave de calidad.</w:t>
+        <w:t>El módulo de Reportes genera indicadores y tablas usando ejecuciones reales, no el estado general de los casos de prueba.</w:t>
       </w:r>
     </w:p>
     <w:p>
@@ -9053,7 +9189,7 @@
           <wp:inline distT="0" distB="0" distL="0" distR="0">
             <wp:extent cx="5219700" cy="3114675"/>
             <wp:effectExtent t="0" r="0" b="0" l="0"/>
-            <wp:docPr id="1" name="" descr="" title=""/>
+            <wp:docPr id="11" name="Captura 11" descr="Reporte de proyecto y selector de ciclo" title="Reporte de proyecto y selector de ciclo"/>
             <wp:cNvGraphicFramePr>
               <a:graphicFrameLocks xmlns:a="http://schemas.openxmlformats.org/drawingml/2006/main" noChangeAspect="1"/>
             </wp:cNvGraphicFramePr>
@@ -9116,7 +9252,7 @@
           <w:sz w:val="22"/>
           <w:szCs w:val="22"/>
         </w:rPr>
-        <w:t xml:space="preserve">Usa el desplegable superior para seleccionar el proyecto. El informe se genera automáticamente.</w:t>
+        <w:t>Selecciona primero el proyecto y después el ciclo de prueba. Puedes elegir un ciclo específico o Todos los ciclos para obtener el reporte general del proyecto.</w:t>
       </w:r>
     </w:p>
     <w:p>
@@ -9312,15 +9448,7 @@
           </w:tcPr>
           <w:p>
             <w:r>
-              <w:rPr>
-                <w:rFonts w:ascii="Calibri" w:cs="Calibri" w:eastAsia="Calibri" w:hAnsi="Calibri"/>
-                <w:b w:val="false"/>
-                <w:bCs w:val="false"/>
-                <w:color w:val="000000"/>
-                <w:sz w:val="20"/>
-                <w:szCs w:val="20"/>
-              </w:rPr>
-              <w:t xml:space="preserve">Cantidad de casos en estado "Ejecutado".</w:t>
+              <w:t>Cantidad de casos con al menos una ejecución dentro del alcance seleccionado.</w:t>
             </w:r>
           </w:p>
         </w:tc>
@@ -9366,15 +9494,7 @@
           </w:tcPr>
           <w:p>
             <w:r>
-              <w:rPr>
-                <w:rFonts w:ascii="Calibri" w:cs="Calibri" w:eastAsia="Calibri" w:hAnsi="Calibri"/>
-                <w:b w:val="false"/>
-                <w:bCs w:val="false"/>
-                <w:color w:val="000000"/>
-                <w:sz w:val="20"/>
-                <w:szCs w:val="20"/>
-              </w:rPr>
-              <w:t xml:space="preserve">Porcentaje de casos ejecutados sobre el total.</w:t>
+              <w:t>Porcentaje de casos ejecutados sobre los casos incluidos en el ciclo o proyecto seleccionado.</w:t>
             </w:r>
           </w:p>
         </w:tc>
@@ -9420,15 +9540,7 @@
           </w:tcPr>
           <w:p>
             <w:r>
-              <w:rPr>
-                <w:rFonts w:ascii="Calibri" w:cs="Calibri" w:eastAsia="Calibri" w:hAnsi="Calibri"/>
-                <w:b w:val="false"/>
-                <w:bCs w:val="false"/>
-                <w:color w:val="000000"/>
-                <w:sz w:val="20"/>
-                <w:szCs w:val="20"/>
-              </w:rPr>
-              <w:t xml:space="preserve">Porcentaje de casos ejecutados con resultado Aprobado.</w:t>
+              <w:t>Porcentaje de ejecuciones aprobadas dentro del alcance seleccionado.</w:t>
             </w:r>
           </w:p>
         </w:tc>
@@ -9678,7 +9790,7 @@
     <w:p>
       <w:pPr>
         <w:pStyle w:val="Heading1"/>
-        <w:pageBreakBefore/>
+        <w:pageBreakBefore w:val="0"/>
         <w:spacing w:after="200" w:before="200"/>
       </w:pPr>
       <w:r>
@@ -9716,7 +9828,7 @@
           <wp:inline distT="0" distB="0" distL="0" distR="0">
             <wp:extent cx="5219700" cy="3114675"/>
             <wp:effectExtent t="0" r="0" b="0" l="0"/>
-            <wp:docPr id="1" name="" descr="" title=""/>
+            <wp:docPr id="12" name="Captura 12" descr="Administración de usuarios del sistema" title="Administración de usuarios del sistema"/>
             <wp:cNvGraphicFramePr>
               <a:graphicFrameLocks xmlns:a="http://schemas.openxmlformats.org/drawingml/2006/main" noChangeAspect="1"/>
             </wp:cNvGraphicFramePr>
@@ -10256,7 +10368,7 @@
           <w:sz w:val="22"/>
           <w:szCs w:val="22"/>
         </w:rPr>
-        <w:t xml:space="preserve">Los Catálogos permiten personalizar los valores de los desplegables del sistema. Módulo exclusivo del Administrador.</w:t>
+        <w:t>Los Catálogos permiten administrar los valores de las listas desplegables. Administrador y QA Lead pueden gestionar sus elementos.</w:t>
       </w:r>
     </w:p>
     <w:p>
@@ -10269,7 +10381,7 @@
           <wp:inline distT="0" distB="0" distL="0" distR="0">
             <wp:extent cx="5219700" cy="3114675"/>
             <wp:effectExtent t="0" r="0" b="0" l="0"/>
-            <wp:docPr id="1" name="" descr="" title=""/>
+            <wp:docPr id="13" name="Captura 13" descr="Administración de grupos y elementos de catálogo" title="Administración de grupos y elementos de catálogo"/>
             <wp:cNvGraphicFramePr>
               <a:graphicFrameLocks xmlns:a="http://schemas.openxmlformats.org/drawingml/2006/main" noChangeAspect="1"/>
             </wp:cNvGraphicFramePr>
@@ -10332,7 +10444,7 @@
           <w:sz w:val="22"/>
           <w:szCs w:val="22"/>
         </w:rPr>
-        <w:t xml:space="preserve">El panel izquierdo muestra los grupos disponibles (ej: TIPO_PRUEBA, SEVERIDAD_DEFECTO). Haz clic en un grupo para ver sus elementos.</w:t>
+        <w:t>El panel izquierdo muestra los grupos disponibles, incluido Clientes. Selecciona un grupo para consultar sus elementos activos e inactivos.</w:t>
       </w:r>
     </w:p>
     <w:p>
@@ -10474,15 +10586,7 @@
           </w:tcPr>
           <w:p>
             <w:r>
-              <w:rPr>
-                <w:rFonts w:ascii="Calibri" w:cs="Calibri" w:eastAsia="Calibri" w:hAnsi="Calibri"/>
-                <w:b w:val="false"/>
-                <w:bCs w:val="false"/>
-                <w:color w:val="000000"/>
-                <w:sz w:val="20"/>
-                <w:szCs w:val="20"/>
-              </w:rPr>
-              <w:t xml:space="preserve">Posición en el desplegable.</w:t>
+              <w:t>Posición en el desplegable. Para Clientes se genera automáticamente y se conserva al editar.</w:t>
             </w:r>
           </w:p>
         </w:tc>
@@ -10528,15 +10632,7 @@
           </w:tcPr>
           <w:p>
             <w:r>
-              <w:rPr>
-                <w:rFonts w:ascii="Calibri" w:cs="Calibri" w:eastAsia="Calibri" w:hAnsi="Calibri"/>
-                <w:b w:val="false"/>
-                <w:bCs w:val="false"/>
-                <w:color w:val="000000"/>
-                <w:sz w:val="20"/>
-                <w:szCs w:val="20"/>
-              </w:rPr>
-              <w:t xml:space="preserve">Valor interno (debe coincidir exactamente con el esperado por el backend).</w:t>
+              <w:t>Valor interno. Para Clientes se genera automáticamente con formato CLI-XXX y no se muestra en el formulario del proyecto.</w:t>
             </w:r>
           </w:p>
         </w:tc>
@@ -10582,15 +10678,7 @@
           </w:tcPr>
           <w:p>
             <w:r>
-              <w:rPr>
-                <w:rFonts w:ascii="Calibri" w:cs="Calibri" w:eastAsia="Calibri" w:hAnsi="Calibri"/>
-                <w:b w:val="false"/>
-                <w:bCs w:val="false"/>
-                <w:color w:val="000000"/>
-                <w:sz w:val="20"/>
-                <w:szCs w:val="20"/>
-              </w:rPr>
-              <w:t xml:space="preserve">Texto que se muestra al usuario.</w:t>
+              <w:t>Texto visible. En el selector de Cliente se muestra únicamente el nombre.</w:t>
             </w:r>
           </w:p>
         </w:tc>
@@ -10725,6 +10813,30 @@
           <w:szCs w:val="21"/>
         </w:rPr>
         <w:t xml:space="preserve">💡 Los elementos marcados con 🔒 son del sistema y no pueden eliminarse, ya que son requeridos por el motor de reglas.</w:t>
+      </w:r>
+    </w:p>
+    <w:p>
+      <w:pPr>
+        <w:pStyle w:val="ListParagraph"/>
+      </w:pPr>
+      <w:r>
+        <w:rPr>
+          <w:rFonts w:ascii="Calibri" w:hAnsi="Calibri"/>
+          <w:sz w:val="22"/>
+        </w:rPr>
+        <w:t>Para registrar un cliente, selecciona Clientes y pulsa Nuevo Ítem. El modal solicita Nombre, Descripción y Estado; Código y Orden son incrementales y automáticos.</w:t>
+      </w:r>
+    </w:p>
+    <w:p>
+      <w:pPr>
+        <w:pStyle w:val="ListParagraph"/>
+      </w:pPr>
+      <w:r>
+        <w:rPr>
+          <w:rFonts w:ascii="Calibri" w:hAnsi="Calibri"/>
+          <w:sz w:val="22"/>
+        </w:rPr>
+        <w:t>Un cliente asociado a proyectos no puede eliminarse. Puede desactivarse para impedir nuevas selecciones sin afectar el historial.</w:t>
       </w:r>
     </w:p>
     <w:p>
@@ -11217,6 +11329,120 @@
           </w:p>
         </w:tc>
       </w:tr>
+      <w:tr>
+        <w:tc>
+          <w:tcPr>
+            <w:tcW w:type="dxa" w:w="100"/>
+            <w:vAlign w:val="center"/>
+          </w:tcPr>
+          <w:p>
+            <w:pPr>
+              <w:spacing w:after="0" w:before="0"/>
+            </w:pPr>
+            <w:r>
+              <w:rPr>
+                <w:rFonts w:ascii="Calibri" w:hAnsi="Calibri"/>
+                <w:sz w:val="18"/>
+              </w:rPr>
+              <w:t>Recordatorio de inicio de pruebas</w:t>
+            </w:r>
+          </w:p>
+        </w:tc>
+        <w:tc>
+          <w:tcPr>
+            <w:tcW w:type="dxa" w:w="100"/>
+            <w:vAlign w:val="center"/>
+          </w:tcPr>
+          <w:p>
+            <w:pPr>
+              <w:spacing w:after="0" w:before="0"/>
+            </w:pPr>
+            <w:r>
+              <w:rPr>
+                <w:rFonts w:ascii="Calibri" w:hAnsi="Calibri"/>
+                <w:sz w:val="18"/>
+              </w:rPr>
+              <w:t>Se envía al Responsable QA antes de la fecha planificada de inicio del ciclo.</w:t>
+            </w:r>
+          </w:p>
+        </w:tc>
+      </w:tr>
+      <w:tr>
+        <w:tc>
+          <w:tcPr>
+            <w:tcW w:type="dxa" w:w="100"/>
+            <w:vAlign w:val="center"/>
+          </w:tcPr>
+          <w:p>
+            <w:pPr>
+              <w:spacing w:after="0" w:before="0"/>
+            </w:pPr>
+            <w:r>
+              <w:rPr>
+                <w:rFonts w:ascii="Calibri" w:hAnsi="Calibri"/>
+                <w:sz w:val="18"/>
+              </w:rPr>
+              <w:t>Inicio de ciclo de pruebas</w:t>
+            </w:r>
+          </w:p>
+        </w:tc>
+        <w:tc>
+          <w:tcPr>
+            <w:tcW w:type="dxa" w:w="100"/>
+            <w:vAlign w:val="center"/>
+          </w:tcPr>
+          <w:p>
+            <w:pPr>
+              <w:spacing w:after="0" w:before="0"/>
+            </w:pPr>
+            <w:r>
+              <w:rPr>
+                <w:rFonts w:ascii="Calibri" w:hAnsi="Calibri"/>
+                <w:sz w:val="18"/>
+              </w:rPr>
+              <w:t>Notificación institucional al Responsable QA cuando corresponde iniciar la ejecución.</w:t>
+            </w:r>
+          </w:p>
+        </w:tc>
+      </w:tr>
+      <w:tr>
+        <w:tc>
+          <w:tcPr>
+            <w:tcW w:type="dxa" w:w="100"/>
+            <w:vAlign w:val="center"/>
+          </w:tcPr>
+          <w:p>
+            <w:pPr>
+              <w:spacing w:after="0" w:before="0"/>
+            </w:pPr>
+            <w:r>
+              <w:rPr>
+                <w:rFonts w:ascii="Calibri" w:hAnsi="Calibri"/>
+                <w:sz w:val="18"/>
+              </w:rPr>
+              <w:t>Cierre del ciclo</w:t>
+            </w:r>
+          </w:p>
+        </w:tc>
+        <w:tc>
+          <w:tcPr>
+            <w:tcW w:type="dxa" w:w="100"/>
+            <w:vAlign w:val="center"/>
+          </w:tcPr>
+          <w:p>
+            <w:pPr>
+              <w:spacing w:after="0" w:before="0"/>
+            </w:pPr>
+            <w:r>
+              <w:rPr>
+                <w:rFonts w:ascii="Calibri" w:hAnsi="Calibri"/>
+                <w:sz w:val="18"/>
+              </w:rPr>
+              <w:t>Se envía al finalizar el ciclo e incluye la conclusión y el enlace al sistema.</w:t>
+            </w:r>
+          </w:p>
+        </w:tc>
+      </w:tr>
     </w:tbl>
     <w:p>
       <w:pPr>
@@ -12115,6 +12341,82 @@
                 <w:szCs w:val="20"/>
               </w:rPr>
               <w:t xml:space="preserve">Impacto del defecto: Crítico, Alto, Medio o Bajo.</w:t>
+            </w:r>
+          </w:p>
+        </w:tc>
+      </w:tr>
+      <w:tr>
+        <w:tc>
+          <w:tcPr>
+            <w:tcW w:type="dxa" w:w="100"/>
+            <w:vAlign w:val="center"/>
+          </w:tcPr>
+          <w:p>
+            <w:pPr>
+              <w:spacing w:after="0" w:before="0"/>
+            </w:pPr>
+            <w:r>
+              <w:rPr>
+                <w:rFonts w:ascii="Calibri" w:hAnsi="Calibri"/>
+                <w:sz w:val="18"/>
+              </w:rPr>
+              <w:t>Caso bloqueado</w:t>
+            </w:r>
+          </w:p>
+        </w:tc>
+        <w:tc>
+          <w:tcPr>
+            <w:tcW w:type="dxa" w:w="100"/>
+            <w:vAlign w:val="center"/>
+          </w:tcPr>
+          <w:p>
+            <w:pPr>
+              <w:spacing w:after="0" w:before="0"/>
+            </w:pPr>
+            <w:r>
+              <w:rPr>
+                <w:rFonts w:ascii="Calibri" w:hAnsi="Calibri"/>
+                <w:sz w:val="18"/>
+              </w:rPr>
+              <w:t>Caso que no puede ejecutarse porque depende de un caso fallido y su defecto asociado.</w:t>
+            </w:r>
+          </w:p>
+        </w:tc>
+      </w:tr>
+      <w:tr>
+        <w:tc>
+          <w:tcPr>
+            <w:tcW w:type="dxa" w:w="100"/>
+            <w:vAlign w:val="center"/>
+          </w:tcPr>
+          <w:p>
+            <w:pPr>
+              <w:spacing w:after="0" w:before="0"/>
+            </w:pPr>
+            <w:r>
+              <w:rPr>
+                <w:rFonts w:ascii="Calibri" w:hAnsi="Calibri"/>
+                <w:sz w:val="18"/>
+              </w:rPr>
+              <w:t>Versión de ejecución</w:t>
+            </w:r>
+          </w:p>
+        </w:tc>
+        <w:tc>
+          <w:tcPr>
+            <w:tcW w:type="dxa" w:w="100"/>
+            <w:vAlign w:val="center"/>
+          </w:tcPr>
+          <w:p>
+            <w:pPr>
+              <w:spacing w:after="0" w:before="0"/>
+            </w:pPr>
+            <w:r>
+              <w:rPr>
+                <w:rFonts w:ascii="Calibri" w:hAnsi="Calibri"/>
+                <w:sz w:val="18"/>
+              </w:rPr>
+              <w:t>Registro independiente de una nueva ejecución del mismo caso dentro de un ciclo.</w:t>
             </w:r>
           </w:p>
         </w:tc>

</xml_diff>